<commit_message>
He añadido el documento del trabajo
</commit_message>
<xml_diff>
--- a/BarcoRefac.docx
+++ b/BarcoRefac.docx
@@ -166,7 +166,7 @@
                     <wp:inline distT="0" distB="0" distL="0" distR="0" wp14:anchorId="79193485">
                       <wp:extent cx="3212465" cy="955675"/>
                       <wp:effectExtent l="0" t="0" r="0" b="0"/>
-                      <wp:docPr id="3" name="Cuadro de texto 1"/>
+                      <wp:docPr id="3" name="Cuadro de texto 2"/>
                       <a:graphic xmlns:a="http://schemas.openxmlformats.org/drawingml/2006/main">
                         <a:graphicData uri="http://schemas.microsoft.com/office/word/2010/wordprocessingShape">
                           <wps:wsp>
@@ -252,7 +252,7 @@
                 </mc:Choice>
                 <mc:Fallback>
                   <w:pict>
-                    <v:rect id="shape_0" ID="Cuadro de texto 1" path="m0,0l-2147483645,0l-2147483645,-2147483646l0,-2147483646xe" stroked="f" o:allowincell="f" style="position:absolute;margin-left:0pt;margin-top:-75.3pt;width:252.9pt;height:75.2pt;mso-wrap-style:square;v-text-anchor:top;mso-position-vertical:top" wp14:anchorId="79193485">
+                    <v:rect id="shape_0" ID="Cuadro de texto 2" path="m0,0l-2147483645,0l-2147483645,-2147483646l0,-2147483646xe" stroked="f" o:allowincell="f" style="position:absolute;margin-left:0pt;margin-top:-75.3pt;width:252.9pt;height:75.2pt;mso-wrap-style:square;v-text-anchor:top;mso-position-vertical:top" wp14:anchorId="79193485">
                       <v:fill o:detectmouseclick="t" on="false"/>
                       <v:stroke color="#3465a4" weight="6480" joinstyle="round" endcap="flat"/>
                       <v:textbox>
@@ -328,7 +328,7 @@
                     <wp:inline distT="0" distB="0" distL="0" distR="0" wp14:anchorId="56D53BD6">
                       <wp:extent cx="1391285" cy="635"/>
                       <wp:effectExtent l="0" t="19050" r="19050" b="19050"/>
-                      <wp:docPr id="4" name="Conector recto 1" descr="divisor de texto"/>
+                      <wp:docPr id="4" name="Conector recto 3" descr="divisor de texto"/>
                       <a:graphic xmlns:a="http://schemas.openxmlformats.org/drawingml/2006/main">
                         <a:graphicData uri="http://schemas.microsoft.com/office/word/2010/wordprocessingShape">
                           <wps:wsp>
@@ -369,7 +369,7 @@
                 </mc:Choice>
                 <mc:Fallback>
                   <w:pict>
-                    <v:line id="shape_0" from="0pt,-3.1pt" to="109.5pt,-3.1pt" ID="Conector recto 1" stroked="t" o:allowincell="f" style="position:absolute;mso-position-vertical:top" wp14:anchorId="56D53BD6">
+                    <v:line id="shape_0" from="0pt,-3.1pt" to="109.5pt,-3.1pt" ID="Conector recto 3" stroked="t" o:allowincell="f" style="position:absolute;mso-position-vertical:top" wp14:anchorId="56D53BD6">
                       <v:stroke color="#0f0d29" weight="38160" joinstyle="round" endcap="flat"/>
                       <v:fill o:detectmouseclick="t" on="false"/>
                       <w10:wrap type="square"/>
@@ -503,7 +503,7 @@
                     <wp:inline distT="0" distB="0" distL="0" distR="0" wp14:anchorId="01B01D37">
                       <wp:extent cx="1494155" cy="635"/>
                       <wp:effectExtent l="0" t="19050" r="30480" b="19050"/>
-                      <wp:docPr id="6" name="Conector recto 2" descr="divisor de texto"/>
+                      <wp:docPr id="6" name="Conector recto 4" descr="divisor de texto"/>
                       <a:graphic xmlns:a="http://schemas.openxmlformats.org/drawingml/2006/main">
                         <a:graphicData uri="http://schemas.microsoft.com/office/word/2010/wordprocessingShape">
                           <wps:wsp>
@@ -544,7 +544,7 @@
                 </mc:Choice>
                 <mc:Fallback>
                   <w:pict>
-                    <v:line id="shape_0" from="0pt,-3.1pt" to="117.6pt,-3.1pt" ID="Conector recto 2" stroked="t" o:allowincell="f" style="position:absolute;mso-position-vertical:top" wp14:anchorId="01B01D37">
+                    <v:line id="shape_0" from="0pt,-3.1pt" to="117.6pt,-3.1pt" ID="Conector recto 4" stroked="t" o:allowincell="f" style="position:absolute;mso-position-vertical:top" wp14:anchorId="01B01D37">
                       <v:stroke color="#275f71" weight="38160" joinstyle="round" endcap="flat"/>
                       <v:fill o:detectmouseclick="t" on="false"/>
                       <w10:wrap type="square"/>
@@ -745,8 +745,8 @@
         </w:rPr>
       </w:pPr>
       <w:bookmarkStart w:id="28" w:name="__RefHeading___Toc340_606972209"/>
-      <w:bookmarkStart w:id="29" w:name="_Toc178347531"/>
-      <w:bookmarkStart w:id="30" w:name="_Toc178003820"/>
+      <w:bookmarkStart w:id="29" w:name="_Toc178003820"/>
+      <w:bookmarkStart w:id="30" w:name="_Toc178347531"/>
       <w:bookmarkEnd w:id="28"/>
       <w:r>
         <w:rPr>
@@ -967,7 +967,7 @@
               </w:rPr>
               <w:t>4. Documentación</w:t>
               <w:tab/>
-              <w:t>11</w:t>
+              <w:t>12</w:t>
             </w:r>
           </w:hyperlink>
         </w:p>
@@ -988,7 +988,7 @@
               </w:rPr>
               <w:t>5. Git y GitHub</w:t>
               <w:tab/>
-              <w:t>12</w:t>
+              <w:t>13</w:t>
             </w:r>
           </w:hyperlink>
           <w:r>
@@ -1039,8 +1039,8 @@
         <w:rPr/>
       </w:pPr>
       <w:bookmarkStart w:id="31" w:name="__RefHeading___Toc342_606972209"/>
-      <w:bookmarkStart w:id="32" w:name="_Toc178347532"/>
-      <w:bookmarkStart w:id="33" w:name="_Toc178003821"/>
+      <w:bookmarkStart w:id="32" w:name="_Toc178003821"/>
+      <w:bookmarkStart w:id="33" w:name="_Toc178347532"/>
       <w:bookmarkEnd w:id="31"/>
       <w:r>
         <w:rPr>
@@ -1067,19 +1067,7 @@
       </w:pPr>
       <w:r>
         <w:rPr/>
-        <w:t xml:space="preserve">En este trabajo he realizado una refactorización , utilizado PMD  </w:t>
-      </w:r>
-      <w:r>
-        <w:rPr/>
-        <w:t xml:space="preserve">y generación de </w:t>
-      </w:r>
-      <w:r>
-        <w:rPr/>
-        <w:t xml:space="preserve">JavaDoc. </w:t>
-      </w:r>
-      <w:r>
-        <w:rPr/>
-        <w:t>Todo esto se ve reflejado en Git subiendo todas las cosas a mi repositorio remoto.</w:t>
+        <w:t>En este trabajo he realizado una refactorización , utilizado PMD  y generación de JavaDoc. Todo esto se ve reflejado en Git subiendo todas las cosas a mi repositorio remoto.</w:t>
       </w:r>
     </w:p>
     <w:p>
@@ -4566,6 +4554,146 @@
         <w:rPr/>
       </w:pPr>
       <w:r>
+        <w:drawing>
+          <wp:anchor behindDoc="0" distT="0" distB="0" distL="0" distR="0" simplePos="0" locked="0" layoutInCell="0" allowOverlap="1" relativeHeight="55">
+            <wp:simplePos x="0" y="0"/>
+            <wp:positionH relativeFrom="column">
+              <wp:posOffset>0</wp:posOffset>
+            </wp:positionH>
+            <wp:positionV relativeFrom="paragraph">
+              <wp:posOffset>780415</wp:posOffset>
+            </wp:positionV>
+            <wp:extent cx="6371590" cy="6959600"/>
+            <wp:effectExtent l="0" t="0" r="0" b="0"/>
+            <wp:wrapSquare wrapText="largest"/>
+            <wp:docPr id="20" name="Imagen46" descr=""/>
+            <wp:cNvGraphicFramePr>
+              <a:graphicFrameLocks xmlns:a="http://schemas.openxmlformats.org/drawingml/2006/main" noChangeAspect="1"/>
+            </wp:cNvGraphicFramePr>
+            <a:graphic xmlns:a="http://schemas.openxmlformats.org/drawingml/2006/main">
+              <a:graphicData uri="http://schemas.openxmlformats.org/drawingml/2006/picture">
+                <pic:pic xmlns:pic="http://schemas.openxmlformats.org/drawingml/2006/picture">
+                  <pic:nvPicPr>
+                    <pic:cNvPr id="20" name="Imagen46" descr=""/>
+                    <pic:cNvPicPr>
+                      <a:picLocks noChangeAspect="1" noChangeArrowheads="1"/>
+                    </pic:cNvPicPr>
+                  </pic:nvPicPr>
+                  <pic:blipFill>
+                    <a:blip r:embed="rId16"/>
+                    <a:stretch>
+                      <a:fillRect/>
+                    </a:stretch>
+                  </pic:blipFill>
+                  <pic:spPr bwMode="auto">
+                    <a:xfrm>
+                      <a:off x="0" y="0"/>
+                      <a:ext cx="6371590" cy="6959600"/>
+                    </a:xfrm>
+                    <a:prstGeom prst="rect">
+                      <a:avLst/>
+                    </a:prstGeom>
+                    <a:noFill/>
+                  </pic:spPr>
+                </pic:pic>
+              </a:graphicData>
+            </a:graphic>
+          </wp:anchor>
+        </w:drawing>
+      </w:r>
+      <w:r>
+        <w:rPr>
+          <w:rStyle w:val="Strong"/>
+          <w:b w:val="false"/>
+          <w:bCs w:val="false"/>
+        </w:rPr>
+        <w:t>Podemos cambiar las reglas:</w:t>
+      </w:r>
+    </w:p>
+    <w:p>
+      <w:pPr>
+        <w:pStyle w:val="Normal"/>
+        <w:rPr>
+          <w:rStyle w:val="Strong"/>
+          <w:b w:val="false"/>
+          <w:bCs w:val="false"/>
+        </w:rPr>
+      </w:pPr>
+      <w:r>
+        <w:rPr/>
+      </w:r>
+    </w:p>
+    <w:p>
+      <w:pPr>
+        <w:pStyle w:val="Normal"/>
+        <w:rPr>
+          <w:rStyle w:val="Strong"/>
+          <w:b w:val="false"/>
+          <w:bCs w:val="false"/>
+        </w:rPr>
+      </w:pPr>
+      <w:r>
+        <w:rPr/>
+      </w:r>
+    </w:p>
+    <w:p>
+      <w:pPr>
+        <w:pStyle w:val="Normal"/>
+        <w:rPr>
+          <w:rStyle w:val="Strong"/>
+          <w:b w:val="false"/>
+          <w:bCs w:val="false"/>
+        </w:rPr>
+      </w:pPr>
+      <w:r>
+        <w:rPr/>
+      </w:r>
+    </w:p>
+    <w:p>
+      <w:pPr>
+        <w:pStyle w:val="Normal"/>
+        <w:rPr>
+          <w:rStyle w:val="Strong"/>
+          <w:b w:val="false"/>
+          <w:bCs w:val="false"/>
+        </w:rPr>
+      </w:pPr>
+      <w:r>
+        <w:rPr/>
+      </w:r>
+    </w:p>
+    <w:p>
+      <w:pPr>
+        <w:pStyle w:val="Normal"/>
+        <w:rPr>
+          <w:rStyle w:val="Strong"/>
+          <w:b w:val="false"/>
+          <w:bCs w:val="false"/>
+        </w:rPr>
+      </w:pPr>
+      <w:r>
+        <w:rPr/>
+      </w:r>
+    </w:p>
+    <w:p>
+      <w:pPr>
+        <w:pStyle w:val="Normal"/>
+        <w:rPr>
+          <w:rStyle w:val="Strong"/>
+          <w:b w:val="false"/>
+          <w:bCs w:val="false"/>
+        </w:rPr>
+      </w:pPr>
+      <w:r>
+        <w:rPr/>
+      </w:r>
+    </w:p>
+    <w:p>
+      <w:pPr>
+        <w:pStyle w:val="Normal"/>
+        <w:rPr/>
+      </w:pPr>
+      <w:r>
         <w:rPr>
           <w:rStyle w:val="Strong"/>
           <w:b w:val="false"/>
@@ -4601,7 +4729,7 @@
             <wp:extent cx="4505960" cy="3419475"/>
             <wp:effectExtent l="0" t="0" r="0" b="0"/>
             <wp:wrapSquare wrapText="largest"/>
-            <wp:docPr id="20" name="Imagen14" descr=""/>
+            <wp:docPr id="21" name="Imagen14" descr=""/>
             <wp:cNvGraphicFramePr>
               <a:graphicFrameLocks xmlns:a="http://schemas.openxmlformats.org/drawingml/2006/main" noChangeAspect="1"/>
             </wp:cNvGraphicFramePr>
@@ -4609,13 +4737,13 @@
               <a:graphicData uri="http://schemas.openxmlformats.org/drawingml/2006/picture">
                 <pic:pic xmlns:pic="http://schemas.openxmlformats.org/drawingml/2006/picture">
                   <pic:nvPicPr>
-                    <pic:cNvPr id="20" name="Imagen14" descr=""/>
+                    <pic:cNvPr id="21" name="Imagen14" descr=""/>
                     <pic:cNvPicPr>
                       <a:picLocks noChangeAspect="1" noChangeArrowheads="1"/>
                     </pic:cNvPicPr>
                   </pic:nvPicPr>
                   <pic:blipFill>
-                    <a:blip r:embed="rId16"/>
+                    <a:blip r:embed="rId17"/>
                     <a:stretch>
                       <a:fillRect/>
                     </a:stretch>
@@ -4957,7 +5085,7 @@
             <wp:extent cx="4477385" cy="3134360"/>
             <wp:effectExtent l="0" t="0" r="0" b="0"/>
             <wp:wrapSquare wrapText="largest"/>
-            <wp:docPr id="21" name="Imagen15" descr=""/>
+            <wp:docPr id="22" name="Imagen15" descr=""/>
             <wp:cNvGraphicFramePr>
               <a:graphicFrameLocks xmlns:a="http://schemas.openxmlformats.org/drawingml/2006/main" noChangeAspect="1"/>
             </wp:cNvGraphicFramePr>
@@ -4965,13 +5093,13 @@
               <a:graphicData uri="http://schemas.openxmlformats.org/drawingml/2006/picture">
                 <pic:pic xmlns:pic="http://schemas.openxmlformats.org/drawingml/2006/picture">
                   <pic:nvPicPr>
-                    <pic:cNvPr id="21" name="Imagen15" descr=""/>
+                    <pic:cNvPr id="22" name="Imagen15" descr=""/>
                     <pic:cNvPicPr>
                       <a:picLocks noChangeAspect="1" noChangeArrowheads="1"/>
                     </pic:cNvPicPr>
                   </pic:nvPicPr>
                   <pic:blipFill>
-                    <a:blip r:embed="rId17"/>
+                    <a:blip r:embed="rId18"/>
                     <a:stretch>
                       <a:fillRect/>
                     </a:stretch>
@@ -5338,7 +5466,7 @@
             <wp:extent cx="6371590" cy="2220595"/>
             <wp:effectExtent l="0" t="0" r="0" b="0"/>
             <wp:wrapSquare wrapText="largest"/>
-            <wp:docPr id="22" name="Imagen16" descr=""/>
+            <wp:docPr id="23" name="Imagen16" descr=""/>
             <wp:cNvGraphicFramePr>
               <a:graphicFrameLocks xmlns:a="http://schemas.openxmlformats.org/drawingml/2006/main" noChangeAspect="1"/>
             </wp:cNvGraphicFramePr>
@@ -5346,13 +5474,13 @@
               <a:graphicData uri="http://schemas.openxmlformats.org/drawingml/2006/picture">
                 <pic:pic xmlns:pic="http://schemas.openxmlformats.org/drawingml/2006/picture">
                   <pic:nvPicPr>
-                    <pic:cNvPr id="22" name="Imagen16" descr=""/>
+                    <pic:cNvPr id="23" name="Imagen16" descr=""/>
                     <pic:cNvPicPr>
                       <a:picLocks noChangeAspect="1" noChangeArrowheads="1"/>
                     </pic:cNvPicPr>
                   </pic:nvPicPr>
                   <pic:blipFill>
-                    <a:blip r:embed="rId18"/>
+                    <a:blip r:embed="rId19"/>
                     <a:stretch>
                       <a:fillRect/>
                     </a:stretch>
@@ -5430,7 +5558,7 @@
             <wp:extent cx="6371590" cy="3260725"/>
             <wp:effectExtent l="0" t="0" r="0" b="0"/>
             <wp:wrapSquare wrapText="largest"/>
-            <wp:docPr id="23" name="Imagen17" descr=""/>
+            <wp:docPr id="24" name="Imagen17" descr=""/>
             <wp:cNvGraphicFramePr>
               <a:graphicFrameLocks xmlns:a="http://schemas.openxmlformats.org/drawingml/2006/main" noChangeAspect="1"/>
             </wp:cNvGraphicFramePr>
@@ -5438,13 +5566,13 @@
               <a:graphicData uri="http://schemas.openxmlformats.org/drawingml/2006/picture">
                 <pic:pic xmlns:pic="http://schemas.openxmlformats.org/drawingml/2006/picture">
                   <pic:nvPicPr>
-                    <pic:cNvPr id="23" name="Imagen17" descr=""/>
+                    <pic:cNvPr id="24" name="Imagen17" descr=""/>
                     <pic:cNvPicPr>
                       <a:picLocks noChangeAspect="1" noChangeArrowheads="1"/>
                     </pic:cNvPicPr>
                   </pic:nvPicPr>
                   <pic:blipFill>
-                    <a:blip r:embed="rId19"/>
+                    <a:blip r:embed="rId20"/>
                     <a:stretch>
                       <a:fillRect/>
                     </a:stretch>
@@ -5570,7 +5698,7 @@
             <wp:extent cx="6371590" cy="1344295"/>
             <wp:effectExtent l="0" t="0" r="0" b="0"/>
             <wp:wrapSquare wrapText="largest"/>
-            <wp:docPr id="24" name="Imagen18" descr=""/>
+            <wp:docPr id="25" name="Imagen18" descr=""/>
             <wp:cNvGraphicFramePr>
               <a:graphicFrameLocks xmlns:a="http://schemas.openxmlformats.org/drawingml/2006/main" noChangeAspect="1"/>
             </wp:cNvGraphicFramePr>
@@ -5578,13 +5706,13 @@
               <a:graphicData uri="http://schemas.openxmlformats.org/drawingml/2006/picture">
                 <pic:pic xmlns:pic="http://schemas.openxmlformats.org/drawingml/2006/picture">
                   <pic:nvPicPr>
-                    <pic:cNvPr id="24" name="Imagen18" descr=""/>
+                    <pic:cNvPr id="25" name="Imagen18" descr=""/>
                     <pic:cNvPicPr>
                       <a:picLocks noChangeAspect="1" noChangeArrowheads="1"/>
                     </pic:cNvPicPr>
                   </pic:nvPicPr>
                   <pic:blipFill>
-                    <a:blip r:embed="rId20"/>
+                    <a:blip r:embed="rId21"/>
                     <a:stretch>
                       <a:fillRect/>
                     </a:stretch>
@@ -5677,7 +5805,7 @@
             <wp:extent cx="5610860" cy="1419225"/>
             <wp:effectExtent l="0" t="0" r="0" b="0"/>
             <wp:wrapSquare wrapText="largest"/>
-            <wp:docPr id="25" name="Imagen19" descr=""/>
+            <wp:docPr id="26" name="Imagen19" descr=""/>
             <wp:cNvGraphicFramePr>
               <a:graphicFrameLocks xmlns:a="http://schemas.openxmlformats.org/drawingml/2006/main" noChangeAspect="1"/>
             </wp:cNvGraphicFramePr>
@@ -5685,13 +5813,13 @@
               <a:graphicData uri="http://schemas.openxmlformats.org/drawingml/2006/picture">
                 <pic:pic xmlns:pic="http://schemas.openxmlformats.org/drawingml/2006/picture">
                   <pic:nvPicPr>
-                    <pic:cNvPr id="25" name="Imagen19" descr=""/>
+                    <pic:cNvPr id="26" name="Imagen19" descr=""/>
                     <pic:cNvPicPr>
                       <a:picLocks noChangeAspect="1" noChangeArrowheads="1"/>
                     </pic:cNvPicPr>
                   </pic:nvPicPr>
                   <pic:blipFill>
-                    <a:blip r:embed="rId21"/>
+                    <a:blip r:embed="rId22"/>
                     <a:stretch>
                       <a:fillRect/>
                     </a:stretch>
@@ -5865,7 +5993,7 @@
             <wp:extent cx="6371590" cy="1261745"/>
             <wp:effectExtent l="0" t="0" r="0" b="0"/>
             <wp:wrapSquare wrapText="largest"/>
-            <wp:docPr id="26" name="Imagen20" descr=""/>
+            <wp:docPr id="27" name="Imagen20" descr=""/>
             <wp:cNvGraphicFramePr>
               <a:graphicFrameLocks xmlns:a="http://schemas.openxmlformats.org/drawingml/2006/main" noChangeAspect="1"/>
             </wp:cNvGraphicFramePr>
@@ -5873,13 +6001,13 @@
               <a:graphicData uri="http://schemas.openxmlformats.org/drawingml/2006/picture">
                 <pic:pic xmlns:pic="http://schemas.openxmlformats.org/drawingml/2006/picture">
                   <pic:nvPicPr>
-                    <pic:cNvPr id="26" name="Imagen20" descr=""/>
+                    <pic:cNvPr id="27" name="Imagen20" descr=""/>
                     <pic:cNvPicPr>
                       <a:picLocks noChangeAspect="1" noChangeArrowheads="1"/>
                     </pic:cNvPicPr>
                   </pic:nvPicPr>
                   <pic:blipFill>
-                    <a:blip r:embed="rId22"/>
+                    <a:blip r:embed="rId23"/>
                     <a:stretch>
                       <a:fillRect/>
                     </a:stretch>
@@ -5971,7 +6099,7 @@
             <wp:extent cx="6371590" cy="503555"/>
             <wp:effectExtent l="0" t="0" r="0" b="0"/>
             <wp:wrapSquare wrapText="largest"/>
-            <wp:docPr id="27" name="Imagen21" descr=""/>
+            <wp:docPr id="28" name="Imagen21" descr=""/>
             <wp:cNvGraphicFramePr>
               <a:graphicFrameLocks xmlns:a="http://schemas.openxmlformats.org/drawingml/2006/main" noChangeAspect="1"/>
             </wp:cNvGraphicFramePr>
@@ -5979,13 +6107,13 @@
               <a:graphicData uri="http://schemas.openxmlformats.org/drawingml/2006/picture">
                 <pic:pic xmlns:pic="http://schemas.openxmlformats.org/drawingml/2006/picture">
                   <pic:nvPicPr>
-                    <pic:cNvPr id="27" name="Imagen21" descr=""/>
+                    <pic:cNvPr id="28" name="Imagen21" descr=""/>
                     <pic:cNvPicPr>
                       <a:picLocks noChangeAspect="1" noChangeArrowheads="1"/>
                     </pic:cNvPicPr>
                   </pic:nvPicPr>
                   <pic:blipFill>
-                    <a:blip r:embed="rId23"/>
+                    <a:blip r:embed="rId24"/>
                     <a:stretch>
                       <a:fillRect/>
                     </a:stretch>
@@ -6108,7 +6236,7 @@
             <wp:extent cx="6371590" cy="2895600"/>
             <wp:effectExtent l="0" t="0" r="0" b="0"/>
             <wp:wrapSquare wrapText="largest"/>
-            <wp:docPr id="28" name="Imagen22" descr=""/>
+            <wp:docPr id="29" name="Imagen22" descr=""/>
             <wp:cNvGraphicFramePr>
               <a:graphicFrameLocks xmlns:a="http://schemas.openxmlformats.org/drawingml/2006/main" noChangeAspect="1"/>
             </wp:cNvGraphicFramePr>
@@ -6116,13 +6244,13 @@
               <a:graphicData uri="http://schemas.openxmlformats.org/drawingml/2006/picture">
                 <pic:pic xmlns:pic="http://schemas.openxmlformats.org/drawingml/2006/picture">
                   <pic:nvPicPr>
-                    <pic:cNvPr id="28" name="Imagen22" descr=""/>
+                    <pic:cNvPr id="29" name="Imagen22" descr=""/>
                     <pic:cNvPicPr>
                       <a:picLocks noChangeAspect="1" noChangeArrowheads="1"/>
                     </pic:cNvPicPr>
                   </pic:nvPicPr>
                   <pic:blipFill>
-                    <a:blip r:embed="rId24"/>
+                    <a:blip r:embed="rId25"/>
                     <a:stretch>
                       <a:fillRect/>
                     </a:stretch>
@@ -6187,7 +6315,7 @@
             <wp:extent cx="6371590" cy="4113530"/>
             <wp:effectExtent l="0" t="0" r="0" b="0"/>
             <wp:wrapSquare wrapText="largest"/>
-            <wp:docPr id="29" name="Imagen23" descr=""/>
+            <wp:docPr id="30" name="Imagen23" descr=""/>
             <wp:cNvGraphicFramePr>
               <a:graphicFrameLocks xmlns:a="http://schemas.openxmlformats.org/drawingml/2006/main" noChangeAspect="1"/>
             </wp:cNvGraphicFramePr>
@@ -6195,13 +6323,13 @@
               <a:graphicData uri="http://schemas.openxmlformats.org/drawingml/2006/picture">
                 <pic:pic xmlns:pic="http://schemas.openxmlformats.org/drawingml/2006/picture">
                   <pic:nvPicPr>
-                    <pic:cNvPr id="29" name="Imagen23" descr=""/>
+                    <pic:cNvPr id="30" name="Imagen23" descr=""/>
                     <pic:cNvPicPr>
                       <a:picLocks noChangeAspect="1" noChangeArrowheads="1"/>
                     </pic:cNvPicPr>
                   </pic:nvPicPr>
                   <pic:blipFill>
-                    <a:blip r:embed="rId25"/>
+                    <a:blip r:embed="rId26"/>
                     <a:stretch>
                       <a:fillRect/>
                     </a:stretch>
@@ -6304,7 +6432,7 @@
             <wp:extent cx="6371590" cy="977265"/>
             <wp:effectExtent l="0" t="0" r="0" b="0"/>
             <wp:wrapSquare wrapText="largest"/>
-            <wp:docPr id="30" name="Imagen24" descr=""/>
+            <wp:docPr id="31" name="Imagen24" descr=""/>
             <wp:cNvGraphicFramePr>
               <a:graphicFrameLocks xmlns:a="http://schemas.openxmlformats.org/drawingml/2006/main" noChangeAspect="1"/>
             </wp:cNvGraphicFramePr>
@@ -6312,13 +6440,13 @@
               <a:graphicData uri="http://schemas.openxmlformats.org/drawingml/2006/picture">
                 <pic:pic xmlns:pic="http://schemas.openxmlformats.org/drawingml/2006/picture">
                   <pic:nvPicPr>
-                    <pic:cNvPr id="30" name="Imagen24" descr=""/>
+                    <pic:cNvPr id="31" name="Imagen24" descr=""/>
                     <pic:cNvPicPr>
                       <a:picLocks noChangeAspect="1" noChangeArrowheads="1"/>
                     </pic:cNvPicPr>
                   </pic:nvPicPr>
                   <pic:blipFill>
-                    <a:blip r:embed="rId26"/>
+                    <a:blip r:embed="rId27"/>
                     <a:stretch>
                       <a:fillRect/>
                     </a:stretch>
@@ -6396,7 +6524,7 @@
             <wp:extent cx="6371590" cy="3656965"/>
             <wp:effectExtent l="0" t="0" r="0" b="0"/>
             <wp:wrapSquare wrapText="largest"/>
-            <wp:docPr id="31" name="Imagen25" descr=""/>
+            <wp:docPr id="32" name="Imagen25" descr=""/>
             <wp:cNvGraphicFramePr>
               <a:graphicFrameLocks xmlns:a="http://schemas.openxmlformats.org/drawingml/2006/main" noChangeAspect="1"/>
             </wp:cNvGraphicFramePr>
@@ -6404,13 +6532,13 @@
               <a:graphicData uri="http://schemas.openxmlformats.org/drawingml/2006/picture">
                 <pic:pic xmlns:pic="http://schemas.openxmlformats.org/drawingml/2006/picture">
                   <pic:nvPicPr>
-                    <pic:cNvPr id="31" name="Imagen25" descr=""/>
+                    <pic:cNvPr id="32" name="Imagen25" descr=""/>
                     <pic:cNvPicPr>
                       <a:picLocks noChangeAspect="1" noChangeArrowheads="1"/>
                     </pic:cNvPicPr>
                   </pic:nvPicPr>
                   <pic:blipFill>
-                    <a:blip r:embed="rId27"/>
+                    <a:blip r:embed="rId28"/>
                     <a:stretch>
                       <a:fillRect/>
                     </a:stretch>
@@ -6473,37 +6601,17 @@
           <w:i/>
           <w:iCs/>
         </w:rPr>
-        <w:t>-</w:t>
-      </w:r>
-      <w:r>
-        <w:rPr>
-          <w:rStyle w:val="Strong"/>
-          <w:b w:val="false"/>
-          <w:bCs w:val="false"/>
-          <w:i/>
-          <w:iCs/>
-        </w:rPr>
-        <w:t>u</w:t>
-      </w:r>
-      <w:r>
-        <w:rPr>
-          <w:rStyle w:val="Strong"/>
-          <w:b w:val="false"/>
-          <w:bCs w:val="false"/>
-          <w:i w:val="false"/>
-          <w:iCs w:val="false"/>
-        </w:rPr>
-        <w:t xml:space="preserve"> </w:t>
-      </w:r>
-      <w:r>
-        <w:rPr>
-          <w:rStyle w:val="Strong"/>
-          <w:b w:val="false"/>
-          <w:bCs w:val="false"/>
-          <w:i w:val="false"/>
-          <w:iCs w:val="false"/>
-        </w:rPr>
-        <w:t xml:space="preserve">a </w:t>
+        <w:t>-u</w:t>
+      </w:r>
+      <w:r>
+        <w:rPr>
+          <w:rStyle w:val="Strong"/>
+          <w:b w:val="false"/>
+          <w:bCs w:val="false"/>
+          <w:i w:val="false"/>
+          <w:iCs w:val="false"/>
+        </w:rPr>
+        <w:t xml:space="preserve"> a </w:t>
       </w:r>
       <w:r>
         <w:rPr>
@@ -6612,7 +6720,7 @@
             <wp:extent cx="6371590" cy="755015"/>
             <wp:effectExtent l="0" t="0" r="0" b="0"/>
             <wp:wrapSquare wrapText="largest"/>
-            <wp:docPr id="32" name="Imagen26" descr=""/>
+            <wp:docPr id="33" name="Imagen26" descr=""/>
             <wp:cNvGraphicFramePr>
               <a:graphicFrameLocks xmlns:a="http://schemas.openxmlformats.org/drawingml/2006/main" noChangeAspect="1"/>
             </wp:cNvGraphicFramePr>
@@ -6620,13 +6728,13 @@
               <a:graphicData uri="http://schemas.openxmlformats.org/drawingml/2006/picture">
                 <pic:pic xmlns:pic="http://schemas.openxmlformats.org/drawingml/2006/picture">
                   <pic:nvPicPr>
-                    <pic:cNvPr id="32" name="Imagen26" descr=""/>
+                    <pic:cNvPr id="33" name="Imagen26" descr=""/>
                     <pic:cNvPicPr>
                       <a:picLocks noChangeAspect="1" noChangeArrowheads="1"/>
                     </pic:cNvPicPr>
                   </pic:nvPicPr>
                   <pic:blipFill>
-                    <a:blip r:embed="rId28"/>
+                    <a:blip r:embed="rId29"/>
                     <a:stretch>
                       <a:fillRect/>
                     </a:stretch>
@@ -6841,7 +6949,7 @@
             <wp:extent cx="6371590" cy="1521460"/>
             <wp:effectExtent l="0" t="0" r="0" b="0"/>
             <wp:wrapSquare wrapText="largest"/>
-            <wp:docPr id="33" name="Imagen27" descr=""/>
+            <wp:docPr id="34" name="Imagen27" descr=""/>
             <wp:cNvGraphicFramePr>
               <a:graphicFrameLocks xmlns:a="http://schemas.openxmlformats.org/drawingml/2006/main" noChangeAspect="1"/>
             </wp:cNvGraphicFramePr>
@@ -6849,13 +6957,13 @@
               <a:graphicData uri="http://schemas.openxmlformats.org/drawingml/2006/picture">
                 <pic:pic xmlns:pic="http://schemas.openxmlformats.org/drawingml/2006/picture">
                   <pic:nvPicPr>
-                    <pic:cNvPr id="33" name="Imagen27" descr=""/>
+                    <pic:cNvPr id="34" name="Imagen27" descr=""/>
                     <pic:cNvPicPr>
                       <a:picLocks noChangeAspect="1" noChangeArrowheads="1"/>
                     </pic:cNvPicPr>
                   </pic:nvPicPr>
                   <pic:blipFill>
-                    <a:blip r:embed="rId29"/>
+                    <a:blip r:embed="rId30"/>
                     <a:stretch>
                       <a:fillRect/>
                     </a:stretch>
@@ -6918,7 +7026,7 @@
             <wp:extent cx="6371590" cy="1346200"/>
             <wp:effectExtent l="0" t="0" r="0" b="0"/>
             <wp:wrapSquare wrapText="largest"/>
-            <wp:docPr id="34" name="Imagen32" descr=""/>
+            <wp:docPr id="35" name="Imagen32" descr=""/>
             <wp:cNvGraphicFramePr>
               <a:graphicFrameLocks xmlns:a="http://schemas.openxmlformats.org/drawingml/2006/main" noChangeAspect="1"/>
             </wp:cNvGraphicFramePr>
@@ -6926,13 +7034,13 @@
               <a:graphicData uri="http://schemas.openxmlformats.org/drawingml/2006/picture">
                 <pic:pic xmlns:pic="http://schemas.openxmlformats.org/drawingml/2006/picture">
                   <pic:nvPicPr>
-                    <pic:cNvPr id="34" name="Imagen32" descr=""/>
+                    <pic:cNvPr id="35" name="Imagen32" descr=""/>
                     <pic:cNvPicPr>
                       <a:picLocks noChangeAspect="1" noChangeArrowheads="1"/>
                     </pic:cNvPicPr>
                   </pic:nvPicPr>
                   <pic:blipFill>
-                    <a:blip r:embed="rId30"/>
+                    <a:blip r:embed="rId31"/>
                     <a:srcRect l="0" t="19775" r="0" b="0"/>
                     <a:stretch>
                       <a:fillRect/>
@@ -7001,7 +7109,7 @@
             <wp:extent cx="6371590" cy="749935"/>
             <wp:effectExtent l="0" t="0" r="0" b="0"/>
             <wp:wrapSquare wrapText="largest"/>
-            <wp:docPr id="35" name="Imagen28" descr=""/>
+            <wp:docPr id="36" name="Imagen28" descr=""/>
             <wp:cNvGraphicFramePr>
               <a:graphicFrameLocks xmlns:a="http://schemas.openxmlformats.org/drawingml/2006/main" noChangeAspect="1"/>
             </wp:cNvGraphicFramePr>
@@ -7009,13 +7117,13 @@
               <a:graphicData uri="http://schemas.openxmlformats.org/drawingml/2006/picture">
                 <pic:pic xmlns:pic="http://schemas.openxmlformats.org/drawingml/2006/picture">
                   <pic:nvPicPr>
-                    <pic:cNvPr id="35" name="Imagen28" descr=""/>
+                    <pic:cNvPr id="36" name="Imagen28" descr=""/>
                     <pic:cNvPicPr>
                       <a:picLocks noChangeAspect="1" noChangeArrowheads="1"/>
                     </pic:cNvPicPr>
                   </pic:nvPicPr>
                   <pic:blipFill>
-                    <a:blip r:embed="rId31"/>
+                    <a:blip r:embed="rId32"/>
                     <a:stretch>
                       <a:fillRect/>
                     </a:stretch>
@@ -7179,7 +7287,7 @@
             <wp:extent cx="5658485" cy="2409825"/>
             <wp:effectExtent l="0" t="0" r="0" b="0"/>
             <wp:wrapSquare wrapText="largest"/>
-            <wp:docPr id="36" name="Imagen29" descr=""/>
+            <wp:docPr id="37" name="Imagen29" descr=""/>
             <wp:cNvGraphicFramePr>
               <a:graphicFrameLocks xmlns:a="http://schemas.openxmlformats.org/drawingml/2006/main" noChangeAspect="1"/>
             </wp:cNvGraphicFramePr>
@@ -7187,13 +7295,13 @@
               <a:graphicData uri="http://schemas.openxmlformats.org/drawingml/2006/picture">
                 <pic:pic xmlns:pic="http://schemas.openxmlformats.org/drawingml/2006/picture">
                   <pic:nvPicPr>
-                    <pic:cNvPr id="36" name="Imagen29" descr=""/>
+                    <pic:cNvPr id="37" name="Imagen29" descr=""/>
                     <pic:cNvPicPr>
                       <a:picLocks noChangeAspect="1" noChangeArrowheads="1"/>
                     </pic:cNvPicPr>
                   </pic:nvPicPr>
                   <pic:blipFill>
-                    <a:blip r:embed="rId32"/>
+                    <a:blip r:embed="rId33"/>
                     <a:stretch>
                       <a:fillRect/>
                     </a:stretch>
@@ -7397,7 +7505,7 @@
             <wp:extent cx="6371590" cy="3433445"/>
             <wp:effectExtent l="0" t="0" r="0" b="0"/>
             <wp:wrapSquare wrapText="largest"/>
-            <wp:docPr id="37" name="Imagen30" descr=""/>
+            <wp:docPr id="38" name="Imagen30" descr=""/>
             <wp:cNvGraphicFramePr>
               <a:graphicFrameLocks xmlns:a="http://schemas.openxmlformats.org/drawingml/2006/main" noChangeAspect="1"/>
             </wp:cNvGraphicFramePr>
@@ -7405,13 +7513,13 @@
               <a:graphicData uri="http://schemas.openxmlformats.org/drawingml/2006/picture">
                 <pic:pic xmlns:pic="http://schemas.openxmlformats.org/drawingml/2006/picture">
                   <pic:nvPicPr>
-                    <pic:cNvPr id="37" name="Imagen30" descr=""/>
+                    <pic:cNvPr id="38" name="Imagen30" descr=""/>
                     <pic:cNvPicPr>
                       <a:picLocks noChangeAspect="1" noChangeArrowheads="1"/>
                     </pic:cNvPicPr>
                   </pic:nvPicPr>
                   <pic:blipFill>
-                    <a:blip r:embed="rId33"/>
+                    <a:blip r:embed="rId34"/>
                     <a:stretch>
                       <a:fillRect/>
                     </a:stretch>
@@ -7589,27 +7697,7 @@
           <w:i w:val="false"/>
           <w:iCs w:val="false"/>
         </w:rPr>
-        <w:t xml:space="preserve">Una vez hecho eso lo subimos </w:t>
-      </w:r>
-      <w:r>
-        <w:rPr>
-          <w:rStyle w:val="Strong"/>
-          <w:b w:val="false"/>
-          <w:bCs w:val="false"/>
-          <w:i w:val="false"/>
-          <w:iCs w:val="false"/>
-        </w:rPr>
-        <w:t>(si es la primera vez que hacemos un push, hay que usar el push -u)</w:t>
-      </w:r>
-      <w:r>
-        <w:rPr>
-          <w:rStyle w:val="Strong"/>
-          <w:b w:val="false"/>
-          <w:bCs w:val="false"/>
-          <w:i w:val="false"/>
-          <w:iCs w:val="false"/>
-        </w:rPr>
-        <w:t>:</w:t>
+        <w:t>Una vez hecho eso lo subimos (si es la primera vez que hacemos un push, hay que usar el push -u):</w:t>
       </w:r>
     </w:p>
     <w:p>
@@ -7638,7 +7726,7 @@
             <wp:extent cx="6371590" cy="1609725"/>
             <wp:effectExtent l="0" t="0" r="0" b="0"/>
             <wp:wrapSquare wrapText="largest"/>
-            <wp:docPr id="38" name="Imagen31" descr=""/>
+            <wp:docPr id="39" name="Imagen31" descr=""/>
             <wp:cNvGraphicFramePr>
               <a:graphicFrameLocks xmlns:a="http://schemas.openxmlformats.org/drawingml/2006/main" noChangeAspect="1"/>
             </wp:cNvGraphicFramePr>
@@ -7646,13 +7734,13 @@
               <a:graphicData uri="http://schemas.openxmlformats.org/drawingml/2006/picture">
                 <pic:pic xmlns:pic="http://schemas.openxmlformats.org/drawingml/2006/picture">
                   <pic:nvPicPr>
-                    <pic:cNvPr id="38" name="Imagen31" descr=""/>
+                    <pic:cNvPr id="39" name="Imagen31" descr=""/>
                     <pic:cNvPicPr>
                       <a:picLocks noChangeAspect="1" noChangeArrowheads="1"/>
                     </pic:cNvPicPr>
                   </pic:nvPicPr>
                   <pic:blipFill>
-                    <a:blip r:embed="rId34"/>
+                    <a:blip r:embed="rId35"/>
                     <a:stretch>
                       <a:fillRect/>
                     </a:stretch>
@@ -7720,7 +7808,7 @@
             <wp:extent cx="6371590" cy="5564505"/>
             <wp:effectExtent l="0" t="0" r="0" b="0"/>
             <wp:wrapSquare wrapText="largest"/>
-            <wp:docPr id="39" name="Imagen33" descr=""/>
+            <wp:docPr id="40" name="Imagen33" descr=""/>
             <wp:cNvGraphicFramePr>
               <a:graphicFrameLocks xmlns:a="http://schemas.openxmlformats.org/drawingml/2006/main" noChangeAspect="1"/>
             </wp:cNvGraphicFramePr>
@@ -7728,13 +7816,13 @@
               <a:graphicData uri="http://schemas.openxmlformats.org/drawingml/2006/picture">
                 <pic:pic xmlns:pic="http://schemas.openxmlformats.org/drawingml/2006/picture">
                   <pic:nvPicPr>
-                    <pic:cNvPr id="39" name="Imagen33" descr=""/>
+                    <pic:cNvPr id="40" name="Imagen33" descr=""/>
                     <pic:cNvPicPr>
                       <a:picLocks noChangeAspect="1" noChangeArrowheads="1"/>
                     </pic:cNvPicPr>
                   </pic:nvPicPr>
                   <pic:blipFill>
-                    <a:blip r:embed="rId35"/>
+                    <a:blip r:embed="rId36"/>
                     <a:stretch>
                       <a:fillRect/>
                     </a:stretch>
@@ -7818,7 +7906,7 @@
             <wp:extent cx="6371590" cy="3658870"/>
             <wp:effectExtent l="0" t="0" r="0" b="0"/>
             <wp:wrapSquare wrapText="largest"/>
-            <wp:docPr id="40" name="Imagen34" descr=""/>
+            <wp:docPr id="41" name="Imagen34" descr=""/>
             <wp:cNvGraphicFramePr>
               <a:graphicFrameLocks xmlns:a="http://schemas.openxmlformats.org/drawingml/2006/main" noChangeAspect="1"/>
             </wp:cNvGraphicFramePr>
@@ -7826,13 +7914,13 @@
               <a:graphicData uri="http://schemas.openxmlformats.org/drawingml/2006/picture">
                 <pic:pic xmlns:pic="http://schemas.openxmlformats.org/drawingml/2006/picture">
                   <pic:nvPicPr>
-                    <pic:cNvPr id="40" name="Imagen34" descr=""/>
+                    <pic:cNvPr id="41" name="Imagen34" descr=""/>
                     <pic:cNvPicPr>
                       <a:picLocks noChangeAspect="1" noChangeArrowheads="1"/>
                     </pic:cNvPicPr>
                   </pic:nvPicPr>
                   <pic:blipFill>
-                    <a:blip r:embed="rId36"/>
+                    <a:blip r:embed="rId37"/>
                     <a:stretch>
                       <a:fillRect/>
                     </a:stretch>
@@ -7898,7 +7986,7 @@
             <wp:extent cx="6371590" cy="1950720"/>
             <wp:effectExtent l="0" t="0" r="0" b="0"/>
             <wp:wrapSquare wrapText="largest"/>
-            <wp:docPr id="41" name="Imagen35" descr=""/>
+            <wp:docPr id="42" name="Imagen35" descr=""/>
             <wp:cNvGraphicFramePr>
               <a:graphicFrameLocks xmlns:a="http://schemas.openxmlformats.org/drawingml/2006/main" noChangeAspect="1"/>
             </wp:cNvGraphicFramePr>
@@ -7906,13 +7994,13 @@
               <a:graphicData uri="http://schemas.openxmlformats.org/drawingml/2006/picture">
                 <pic:pic xmlns:pic="http://schemas.openxmlformats.org/drawingml/2006/picture">
                   <pic:nvPicPr>
-                    <pic:cNvPr id="41" name="Imagen35" descr=""/>
+                    <pic:cNvPr id="42" name="Imagen35" descr=""/>
                     <pic:cNvPicPr>
                       <a:picLocks noChangeAspect="1" noChangeArrowheads="1"/>
                     </pic:cNvPicPr>
                   </pic:nvPicPr>
                   <pic:blipFill>
-                    <a:blip r:embed="rId37"/>
+                    <a:blip r:embed="rId38"/>
                     <a:stretch>
                       <a:fillRect/>
                     </a:stretch>
@@ -8106,7 +8194,7 @@
             <wp:extent cx="6371590" cy="3404235"/>
             <wp:effectExtent l="0" t="0" r="0" b="0"/>
             <wp:wrapSquare wrapText="largest"/>
-            <wp:docPr id="42" name="Imagen36" descr=""/>
+            <wp:docPr id="43" name="Imagen36" descr=""/>
             <wp:cNvGraphicFramePr>
               <a:graphicFrameLocks xmlns:a="http://schemas.openxmlformats.org/drawingml/2006/main" noChangeAspect="1"/>
             </wp:cNvGraphicFramePr>
@@ -8114,13 +8202,13 @@
               <a:graphicData uri="http://schemas.openxmlformats.org/drawingml/2006/picture">
                 <pic:pic xmlns:pic="http://schemas.openxmlformats.org/drawingml/2006/picture">
                   <pic:nvPicPr>
-                    <pic:cNvPr id="42" name="Imagen36" descr=""/>
+                    <pic:cNvPr id="43" name="Imagen36" descr=""/>
                     <pic:cNvPicPr>
                       <a:picLocks noChangeAspect="1" noChangeArrowheads="1"/>
                     </pic:cNvPicPr>
                   </pic:nvPicPr>
                   <pic:blipFill>
-                    <a:blip r:embed="rId38"/>
+                    <a:blip r:embed="rId39"/>
                     <a:stretch>
                       <a:fillRect/>
                     </a:stretch>
@@ -8186,7 +8274,7 @@
             <wp:extent cx="6371590" cy="3206115"/>
             <wp:effectExtent l="0" t="0" r="0" b="0"/>
             <wp:wrapSquare wrapText="largest"/>
-            <wp:docPr id="43" name="Imagen37" descr=""/>
+            <wp:docPr id="44" name="Imagen37" descr=""/>
             <wp:cNvGraphicFramePr>
               <a:graphicFrameLocks xmlns:a="http://schemas.openxmlformats.org/drawingml/2006/main" noChangeAspect="1"/>
             </wp:cNvGraphicFramePr>
@@ -8194,13 +8282,13 @@
               <a:graphicData uri="http://schemas.openxmlformats.org/drawingml/2006/picture">
                 <pic:pic xmlns:pic="http://schemas.openxmlformats.org/drawingml/2006/picture">
                   <pic:nvPicPr>
-                    <pic:cNvPr id="43" name="Imagen37" descr=""/>
+                    <pic:cNvPr id="44" name="Imagen37" descr=""/>
                     <pic:cNvPicPr>
                       <a:picLocks noChangeAspect="1" noChangeArrowheads="1"/>
                     </pic:cNvPicPr>
                   </pic:nvPicPr>
                   <pic:blipFill>
-                    <a:blip r:embed="rId39"/>
+                    <a:blip r:embed="rId40"/>
                     <a:stretch>
                       <a:fillRect/>
                     </a:stretch>
@@ -8375,7 +8463,7 @@
           <w:bCs w:val="false"/>
         </w:rPr>
         <w:drawing>
-          <wp:anchor behindDoc="0" distT="0" distB="0" distL="0" distR="0" simplePos="0" locked="0" layoutInCell="0" allowOverlap="1" relativeHeight="47">
+          <wp:anchor behindDoc="0" distT="0" distB="0" distL="0" distR="0" simplePos="0" locked="0" layoutInCell="0" allowOverlap="1" relativeHeight="41">
             <wp:simplePos x="0" y="0"/>
             <wp:positionH relativeFrom="column">
               <wp:align>center</wp:align>
@@ -8386,7 +8474,7 @@
             <wp:extent cx="6371590" cy="5241290"/>
             <wp:effectExtent l="0" t="0" r="0" b="0"/>
             <wp:wrapSquare wrapText="largest"/>
-            <wp:docPr id="44" name="Imagen38" descr=""/>
+            <wp:docPr id="45" name="Imagen38" descr=""/>
             <wp:cNvGraphicFramePr>
               <a:graphicFrameLocks xmlns:a="http://schemas.openxmlformats.org/drawingml/2006/main" noChangeAspect="1"/>
             </wp:cNvGraphicFramePr>
@@ -8394,13 +8482,13 @@
               <a:graphicData uri="http://schemas.openxmlformats.org/drawingml/2006/picture">
                 <pic:pic xmlns:pic="http://schemas.openxmlformats.org/drawingml/2006/picture">
                   <pic:nvPicPr>
-                    <pic:cNvPr id="44" name="Imagen38" descr=""/>
+                    <pic:cNvPr id="45" name="Imagen38" descr=""/>
                     <pic:cNvPicPr>
                       <a:picLocks noChangeAspect="1" noChangeArrowheads="1"/>
                     </pic:cNvPicPr>
                   </pic:nvPicPr>
                   <pic:blipFill>
-                    <a:blip r:embed="rId40"/>
+                    <a:blip r:embed="rId41"/>
                     <a:stretch>
                       <a:fillRect/>
                     </a:stretch>
@@ -8432,137 +8520,170 @@
         </w:rPr>
       </w:pPr>
       <w:r>
-        <w:rPr/>
-      </w:r>
-    </w:p>
-    <w:p>
-      <w:pPr>
-        <w:pStyle w:val="Normal"/>
-        <w:rPr>
-          <w:rStyle w:val="Strong"/>
-          <w:b w:val="false"/>
-          <w:bCs w:val="false"/>
-        </w:rPr>
-      </w:pPr>
-      <w:r>
-        <w:rPr/>
-      </w:r>
-    </w:p>
-    <w:p>
-      <w:pPr>
-        <w:pStyle w:val="Normal"/>
-        <w:rPr>
-          <w:rStyle w:val="Strong"/>
-          <w:b w:val="false"/>
-          <w:bCs w:val="false"/>
-        </w:rPr>
-      </w:pPr>
-      <w:r>
-        <w:rPr/>
-      </w:r>
-    </w:p>
-    <w:p>
-      <w:pPr>
-        <w:pStyle w:val="Normal"/>
-        <w:rPr>
-          <w:rStyle w:val="Strong"/>
-          <w:b w:val="false"/>
-          <w:bCs w:val="false"/>
-        </w:rPr>
-      </w:pPr>
-      <w:r>
-        <w:rPr/>
-      </w:r>
-    </w:p>
-    <w:p>
-      <w:pPr>
-        <w:pStyle w:val="Normal"/>
-        <w:rPr>
-          <w:rStyle w:val="Strong"/>
-          <w:b w:val="false"/>
-          <w:bCs w:val="false"/>
-        </w:rPr>
-      </w:pPr>
-      <w:r>
-        <w:rPr/>
-      </w:r>
-    </w:p>
-    <w:p>
-      <w:pPr>
-        <w:pStyle w:val="Normal"/>
-        <w:rPr>
-          <w:rStyle w:val="Strong"/>
-          <w:b w:val="false"/>
-          <w:bCs w:val="false"/>
-        </w:rPr>
-      </w:pPr>
-      <w:r>
-        <w:rPr/>
-      </w:r>
-    </w:p>
-    <w:p>
-      <w:pPr>
-        <w:pStyle w:val="Normal"/>
-        <w:rPr>
-          <w:rStyle w:val="Strong"/>
-          <w:b w:val="false"/>
-          <w:bCs w:val="false"/>
-        </w:rPr>
-      </w:pPr>
-      <w:r>
-        <w:rPr/>
-      </w:r>
-    </w:p>
-    <w:p>
-      <w:pPr>
-        <w:pStyle w:val="Normal"/>
-        <w:rPr>
-          <w:rStyle w:val="Strong"/>
-          <w:b w:val="false"/>
-          <w:bCs w:val="false"/>
-        </w:rPr>
-      </w:pPr>
-      <w:r>
-        <w:rPr/>
-      </w:r>
-    </w:p>
-    <w:p>
-      <w:pPr>
-        <w:pStyle w:val="Normal"/>
-        <w:rPr>
-          <w:rStyle w:val="Strong"/>
-          <w:b w:val="false"/>
-          <w:bCs w:val="false"/>
-        </w:rPr>
-      </w:pPr>
-      <w:r>
-        <w:rPr/>
-      </w:r>
-    </w:p>
-    <w:p>
-      <w:pPr>
-        <w:pStyle w:val="Normal"/>
-        <w:rPr>
-          <w:rStyle w:val="Strong"/>
-          <w:b w:val="false"/>
-          <w:bCs w:val="false"/>
-        </w:rPr>
-      </w:pPr>
-      <w:r>
-        <w:rPr/>
-      </w:r>
-    </w:p>
-    <w:p>
-      <w:pPr>
-        <w:pStyle w:val="Normal"/>
-        <w:rPr>
-          <w:rStyle w:val="Strong"/>
-          <w:b w:val="false"/>
-          <w:bCs w:val="false"/>
-        </w:rPr>
-      </w:pPr>
-      <w:r>
-        <w:rPr/>
+        <w:rPr>
+          <w:b w:val="false"/>
+          <w:bCs w:val="false"/>
+        </w:rPr>
+      </w:r>
+    </w:p>
+    <w:p>
+      <w:pPr>
+        <w:pStyle w:val="Normal"/>
+        <w:rPr>
+          <w:rStyle w:val="Strong"/>
+          <w:b w:val="false"/>
+          <w:bCs w:val="false"/>
+        </w:rPr>
+      </w:pPr>
+      <w:r>
+        <w:rPr>
+          <w:b w:val="false"/>
+          <w:bCs w:val="false"/>
+        </w:rPr>
+      </w:r>
+    </w:p>
+    <w:p>
+      <w:pPr>
+        <w:pStyle w:val="Normal"/>
+        <w:rPr>
+          <w:rStyle w:val="Strong"/>
+          <w:b w:val="false"/>
+          <w:bCs w:val="false"/>
+        </w:rPr>
+      </w:pPr>
+      <w:r>
+        <w:rPr>
+          <w:b w:val="false"/>
+          <w:bCs w:val="false"/>
+        </w:rPr>
+      </w:r>
+    </w:p>
+    <w:p>
+      <w:pPr>
+        <w:pStyle w:val="Normal"/>
+        <w:rPr>
+          <w:rStyle w:val="Strong"/>
+          <w:b w:val="false"/>
+          <w:bCs w:val="false"/>
+        </w:rPr>
+      </w:pPr>
+      <w:r>
+        <w:rPr>
+          <w:b w:val="false"/>
+          <w:bCs w:val="false"/>
+        </w:rPr>
+      </w:r>
+    </w:p>
+    <w:p>
+      <w:pPr>
+        <w:pStyle w:val="Normal"/>
+        <w:rPr>
+          <w:rStyle w:val="Strong"/>
+          <w:b w:val="false"/>
+          <w:bCs w:val="false"/>
+        </w:rPr>
+      </w:pPr>
+      <w:r>
+        <w:rPr>
+          <w:b w:val="false"/>
+          <w:bCs w:val="false"/>
+        </w:rPr>
+      </w:r>
+    </w:p>
+    <w:p>
+      <w:pPr>
+        <w:pStyle w:val="Normal"/>
+        <w:rPr>
+          <w:rStyle w:val="Strong"/>
+          <w:b w:val="false"/>
+          <w:bCs w:val="false"/>
+        </w:rPr>
+      </w:pPr>
+      <w:r>
+        <w:rPr>
+          <w:b w:val="false"/>
+          <w:bCs w:val="false"/>
+        </w:rPr>
+      </w:r>
+    </w:p>
+    <w:p>
+      <w:pPr>
+        <w:pStyle w:val="Normal"/>
+        <w:rPr>
+          <w:rStyle w:val="Strong"/>
+          <w:b w:val="false"/>
+          <w:bCs w:val="false"/>
+        </w:rPr>
+      </w:pPr>
+      <w:r>
+        <w:rPr>
+          <w:b w:val="false"/>
+          <w:bCs w:val="false"/>
+        </w:rPr>
+      </w:r>
+    </w:p>
+    <w:p>
+      <w:pPr>
+        <w:pStyle w:val="Normal"/>
+        <w:rPr>
+          <w:rStyle w:val="Strong"/>
+          <w:b w:val="false"/>
+          <w:bCs w:val="false"/>
+        </w:rPr>
+      </w:pPr>
+      <w:r>
+        <w:rPr>
+          <w:b w:val="false"/>
+          <w:bCs w:val="false"/>
+        </w:rPr>
+      </w:r>
+    </w:p>
+    <w:p>
+      <w:pPr>
+        <w:pStyle w:val="Normal"/>
+        <w:rPr>
+          <w:rStyle w:val="Strong"/>
+          <w:b w:val="false"/>
+          <w:bCs w:val="false"/>
+        </w:rPr>
+      </w:pPr>
+      <w:r>
+        <w:rPr>
+          <w:b w:val="false"/>
+          <w:bCs w:val="false"/>
+        </w:rPr>
+      </w:r>
+    </w:p>
+    <w:p>
+      <w:pPr>
+        <w:pStyle w:val="Normal"/>
+        <w:rPr>
+          <w:rStyle w:val="Strong"/>
+          <w:b w:val="false"/>
+          <w:bCs w:val="false"/>
+        </w:rPr>
+      </w:pPr>
+      <w:r>
+        <w:rPr>
+          <w:b w:val="false"/>
+          <w:bCs w:val="false"/>
+        </w:rPr>
+      </w:r>
+    </w:p>
+    <w:p>
+      <w:pPr>
+        <w:pStyle w:val="Normal"/>
+        <w:rPr>
+          <w:rStyle w:val="Strong"/>
+          <w:b w:val="false"/>
+          <w:bCs w:val="false"/>
+        </w:rPr>
+      </w:pPr>
+      <w:r>
+        <w:rPr>
+          <w:b w:val="false"/>
+          <w:bCs w:val="false"/>
+        </w:rPr>
       </w:r>
     </w:p>
     <w:p>
@@ -8592,9 +8713,12 @@
         </w:rPr>
       </w:pPr>
       <w:r>
-        <w:rPr/>
+        <w:rPr>
+          <w:b w:val="false"/>
+          <w:bCs w:val="false"/>
+        </w:rPr>
         <w:drawing>
-          <wp:anchor behindDoc="0" distT="0" distB="0" distL="0" distR="0" simplePos="0" locked="0" layoutInCell="0" allowOverlap="1" relativeHeight="48">
+          <wp:anchor behindDoc="0" distT="0" distB="0" distL="0" distR="0" simplePos="0" locked="0" layoutInCell="0" allowOverlap="1" relativeHeight="42">
             <wp:simplePos x="0" y="0"/>
             <wp:positionH relativeFrom="column">
               <wp:align>center</wp:align>
@@ -8605,7 +8729,7 @@
             <wp:extent cx="6371590" cy="4687570"/>
             <wp:effectExtent l="0" t="0" r="0" b="0"/>
             <wp:wrapSquare wrapText="largest"/>
-            <wp:docPr id="45" name="Imagen39" descr=""/>
+            <wp:docPr id="46" name="Imagen39" descr=""/>
             <wp:cNvGraphicFramePr>
               <a:graphicFrameLocks xmlns:a="http://schemas.openxmlformats.org/drawingml/2006/main" noChangeAspect="1"/>
             </wp:cNvGraphicFramePr>
@@ -8613,13 +8737,13 @@
               <a:graphicData uri="http://schemas.openxmlformats.org/drawingml/2006/picture">
                 <pic:pic xmlns:pic="http://schemas.openxmlformats.org/drawingml/2006/picture">
                   <pic:nvPicPr>
-                    <pic:cNvPr id="45" name="Imagen39" descr=""/>
+                    <pic:cNvPr id="46" name="Imagen39" descr=""/>
                     <pic:cNvPicPr>
                       <a:picLocks noChangeAspect="1" noChangeArrowheads="1"/>
                     </pic:cNvPicPr>
                   </pic:nvPicPr>
                   <pic:blipFill>
-                    <a:blip r:embed="rId41"/>
+                    <a:blip r:embed="rId42"/>
                     <a:stretch>
                       <a:fillRect/>
                     </a:stretch>
@@ -8656,7 +8780,7 @@
           <w:bCs w:val="false"/>
         </w:rPr>
         <w:drawing>
-          <wp:anchor behindDoc="0" distT="0" distB="0" distL="0" distR="0" simplePos="0" locked="0" layoutInCell="0" allowOverlap="1" relativeHeight="49">
+          <wp:anchor behindDoc="0" distT="0" distB="0" distL="0" distR="0" simplePos="0" locked="0" layoutInCell="0" allowOverlap="1" relativeHeight="43">
             <wp:simplePos x="0" y="0"/>
             <wp:positionH relativeFrom="column">
               <wp:align>center</wp:align>
@@ -8667,7 +8791,7 @@
             <wp:extent cx="6371590" cy="1650365"/>
             <wp:effectExtent l="0" t="0" r="0" b="0"/>
             <wp:wrapSquare wrapText="largest"/>
-            <wp:docPr id="46" name="Imagen40" descr=""/>
+            <wp:docPr id="47" name="Imagen40" descr=""/>
             <wp:cNvGraphicFramePr>
               <a:graphicFrameLocks xmlns:a="http://schemas.openxmlformats.org/drawingml/2006/main" noChangeAspect="1"/>
             </wp:cNvGraphicFramePr>
@@ -8675,13 +8799,13 @@
               <a:graphicData uri="http://schemas.openxmlformats.org/drawingml/2006/picture">
                 <pic:pic xmlns:pic="http://schemas.openxmlformats.org/drawingml/2006/picture">
                   <pic:nvPicPr>
-                    <pic:cNvPr id="46" name="Imagen40" descr=""/>
+                    <pic:cNvPr id="47" name="Imagen40" descr=""/>
                     <pic:cNvPicPr>
                       <a:picLocks noChangeAspect="1" noChangeArrowheads="1"/>
                     </pic:cNvPicPr>
                   </pic:nvPicPr>
                   <pic:blipFill>
-                    <a:blip r:embed="rId42"/>
+                    <a:blip r:embed="rId43"/>
                     <a:stretch>
                       <a:fillRect/>
                     </a:stretch>
@@ -8848,7 +8972,7 @@
           <w:bCs w:val="false"/>
         </w:rPr>
         <w:drawing>
-          <wp:anchor behindDoc="0" distT="0" distB="0" distL="0" distR="0" simplePos="0" locked="0" layoutInCell="0" allowOverlap="1" relativeHeight="50">
+          <wp:anchor behindDoc="0" distT="0" distB="0" distL="0" distR="0" simplePos="0" locked="0" layoutInCell="0" allowOverlap="1" relativeHeight="44">
             <wp:simplePos x="0" y="0"/>
             <wp:positionH relativeFrom="column">
               <wp:align>center</wp:align>
@@ -8859,7 +8983,7 @@
             <wp:extent cx="6371590" cy="2014220"/>
             <wp:effectExtent l="0" t="0" r="0" b="0"/>
             <wp:wrapSquare wrapText="largest"/>
-            <wp:docPr id="47" name="Imagen41" descr=""/>
+            <wp:docPr id="48" name="Imagen41" descr=""/>
             <wp:cNvGraphicFramePr>
               <a:graphicFrameLocks xmlns:a="http://schemas.openxmlformats.org/drawingml/2006/main" noChangeAspect="1"/>
             </wp:cNvGraphicFramePr>
@@ -8867,13 +8991,13 @@
               <a:graphicData uri="http://schemas.openxmlformats.org/drawingml/2006/picture">
                 <pic:pic xmlns:pic="http://schemas.openxmlformats.org/drawingml/2006/picture">
                   <pic:nvPicPr>
-                    <pic:cNvPr id="47" name="Imagen41" descr=""/>
+                    <pic:cNvPr id="48" name="Imagen41" descr=""/>
                     <pic:cNvPicPr>
                       <a:picLocks noChangeAspect="1" noChangeArrowheads="1"/>
                     </pic:cNvPicPr>
                   </pic:nvPicPr>
                   <pic:blipFill>
-                    <a:blip r:embed="rId43"/>
+                    <a:blip r:embed="rId44"/>
                     <a:stretch>
                       <a:fillRect/>
                     </a:stretch>
@@ -8910,7 +9034,7 @@
           <w:bCs w:val="false"/>
         </w:rPr>
         <w:drawing>
-          <wp:anchor behindDoc="0" distT="0" distB="0" distL="0" distR="0" simplePos="0" locked="0" layoutInCell="0" allowOverlap="1" relativeHeight="51">
+          <wp:anchor behindDoc="0" distT="0" distB="0" distL="0" distR="0" simplePos="0" locked="0" layoutInCell="0" allowOverlap="1" relativeHeight="45">
             <wp:simplePos x="0" y="0"/>
             <wp:positionH relativeFrom="column">
               <wp:align>center</wp:align>
@@ -8921,7 +9045,7 @@
             <wp:extent cx="6371590" cy="1598930"/>
             <wp:effectExtent l="0" t="0" r="0" b="0"/>
             <wp:wrapSquare wrapText="largest"/>
-            <wp:docPr id="48" name="Imagen42" descr=""/>
+            <wp:docPr id="49" name="Imagen42" descr=""/>
             <wp:cNvGraphicFramePr>
               <a:graphicFrameLocks xmlns:a="http://schemas.openxmlformats.org/drawingml/2006/main" noChangeAspect="1"/>
             </wp:cNvGraphicFramePr>
@@ -8929,13 +9053,13 @@
               <a:graphicData uri="http://schemas.openxmlformats.org/drawingml/2006/picture">
                 <pic:pic xmlns:pic="http://schemas.openxmlformats.org/drawingml/2006/picture">
                   <pic:nvPicPr>
-                    <pic:cNvPr id="48" name="Imagen42" descr=""/>
+                    <pic:cNvPr id="49" name="Imagen42" descr=""/>
                     <pic:cNvPicPr>
                       <a:picLocks noChangeAspect="1" noChangeArrowheads="1"/>
                     </pic:cNvPicPr>
                   </pic:nvPicPr>
                   <pic:blipFill>
-                    <a:blip r:embed="rId44"/>
+                    <a:blip r:embed="rId45"/>
                     <a:stretch>
                       <a:fillRect/>
                     </a:stretch>
@@ -8990,7 +9114,7 @@
           <w:bCs w:val="false"/>
         </w:rPr>
         <w:drawing>
-          <wp:anchor behindDoc="0" distT="0" distB="0" distL="0" distR="0" simplePos="0" locked="0" layoutInCell="0" allowOverlap="1" relativeHeight="52">
+          <wp:anchor behindDoc="0" distT="0" distB="0" distL="0" distR="0" simplePos="0" locked="0" layoutInCell="0" allowOverlap="1" relativeHeight="46">
             <wp:simplePos x="0" y="0"/>
             <wp:positionH relativeFrom="column">
               <wp:align>center</wp:align>
@@ -9001,7 +9125,7 @@
             <wp:extent cx="4672965" cy="4131310"/>
             <wp:effectExtent l="0" t="0" r="0" b="0"/>
             <wp:wrapSquare wrapText="largest"/>
-            <wp:docPr id="49" name="Imagen43" descr=""/>
+            <wp:docPr id="50" name="Imagen43" descr=""/>
             <wp:cNvGraphicFramePr>
               <a:graphicFrameLocks xmlns:a="http://schemas.openxmlformats.org/drawingml/2006/main" noChangeAspect="1"/>
             </wp:cNvGraphicFramePr>
@@ -9009,13 +9133,13 @@
               <a:graphicData uri="http://schemas.openxmlformats.org/drawingml/2006/picture">
                 <pic:pic xmlns:pic="http://schemas.openxmlformats.org/drawingml/2006/picture">
                   <pic:nvPicPr>
-                    <pic:cNvPr id="49" name="Imagen43" descr=""/>
+                    <pic:cNvPr id="50" name="Imagen43" descr=""/>
                     <pic:cNvPicPr>
                       <a:picLocks noChangeAspect="1" noChangeArrowheads="1"/>
                     </pic:cNvPicPr>
                   </pic:nvPicPr>
                   <pic:blipFill>
-                    <a:blip r:embed="rId45"/>
+                    <a:blip r:embed="rId46"/>
                     <a:stretch>
                       <a:fillRect/>
                     </a:stretch>
@@ -9308,7 +9432,7 @@
           <w:bCs w:val="false"/>
         </w:rPr>
         <w:drawing>
-          <wp:anchor behindDoc="0" distT="0" distB="0" distL="0" distR="0" simplePos="0" locked="0" layoutInCell="0" allowOverlap="1" relativeHeight="53">
+          <wp:anchor behindDoc="0" distT="0" distB="0" distL="0" distR="0" simplePos="0" locked="0" layoutInCell="0" allowOverlap="1" relativeHeight="47">
             <wp:simplePos x="0" y="0"/>
             <wp:positionH relativeFrom="column">
               <wp:posOffset>0</wp:posOffset>
@@ -9319,7 +9443,7 @@
             <wp:extent cx="6371590" cy="1574165"/>
             <wp:effectExtent l="0" t="0" r="0" b="0"/>
             <wp:wrapSquare wrapText="largest"/>
-            <wp:docPr id="50" name="Imagen44" descr=""/>
+            <wp:docPr id="51" name="Imagen44" descr=""/>
             <wp:cNvGraphicFramePr>
               <a:graphicFrameLocks xmlns:a="http://schemas.openxmlformats.org/drawingml/2006/main" noChangeAspect="1"/>
             </wp:cNvGraphicFramePr>
@@ -9327,13 +9451,13 @@
               <a:graphicData uri="http://schemas.openxmlformats.org/drawingml/2006/picture">
                 <pic:pic xmlns:pic="http://schemas.openxmlformats.org/drawingml/2006/picture">
                   <pic:nvPicPr>
-                    <pic:cNvPr id="50" name="Imagen44" descr=""/>
+                    <pic:cNvPr id="51" name="Imagen44" descr=""/>
                     <pic:cNvPicPr>
                       <a:picLocks noChangeAspect="1" noChangeArrowheads="1"/>
                     </pic:cNvPicPr>
                   </pic:nvPicPr>
                   <pic:blipFill>
-                    <a:blip r:embed="rId46"/>
+                    <a:blip r:embed="rId47"/>
                     <a:stretch>
                       <a:fillRect/>
                     </a:stretch>
@@ -9365,13 +9489,8 @@
         </w:rPr>
       </w:pPr>
       <w:r>
-        <w:rPr>
-          <w:rStyle w:val="Strong"/>
-          <w:b w:val="false"/>
-          <w:bCs w:val="false"/>
-        </w:rPr>
         <w:drawing>
-          <wp:anchor behindDoc="0" distT="0" distB="0" distL="0" distR="0" simplePos="0" locked="0" layoutInCell="0" allowOverlap="1" relativeHeight="54">
+          <wp:anchor behindDoc="0" distT="0" distB="0" distL="0" distR="0" simplePos="0" locked="0" layoutInCell="0" allowOverlap="1" relativeHeight="48">
             <wp:simplePos x="0" y="0"/>
             <wp:positionH relativeFrom="column">
               <wp:posOffset>-10795</wp:posOffset>
@@ -9382,7 +9501,7 @@
             <wp:extent cx="6371590" cy="2679700"/>
             <wp:effectExtent l="0" t="0" r="0" b="0"/>
             <wp:wrapSquare wrapText="largest"/>
-            <wp:docPr id="51" name="Imagen45" descr=""/>
+            <wp:docPr id="52" name="Imagen45" descr=""/>
             <wp:cNvGraphicFramePr>
               <a:graphicFrameLocks xmlns:a="http://schemas.openxmlformats.org/drawingml/2006/main" noChangeAspect="1"/>
             </wp:cNvGraphicFramePr>
@@ -9390,13 +9509,13 @@
               <a:graphicData uri="http://schemas.openxmlformats.org/drawingml/2006/picture">
                 <pic:pic xmlns:pic="http://schemas.openxmlformats.org/drawingml/2006/picture">
                   <pic:nvPicPr>
-                    <pic:cNvPr id="51" name="Imagen45" descr=""/>
+                    <pic:cNvPr id="52" name="Imagen45" descr=""/>
                     <pic:cNvPicPr>
                       <a:picLocks noChangeAspect="1" noChangeArrowheads="1"/>
                     </pic:cNvPicPr>
                   </pic:nvPicPr>
                   <pic:blipFill>
-                    <a:blip r:embed="rId47"/>
+                    <a:blip r:embed="rId48"/>
                     <a:stretch>
                       <a:fillRect/>
                     </a:stretch>
@@ -9462,12 +9581,12 @@
       </w:r>
     </w:p>
     <w:sectPr>
-      <w:headerReference w:type="even" r:id="rId48"/>
-      <w:headerReference w:type="default" r:id="rId49"/>
-      <w:headerReference w:type="first" r:id="rId50"/>
-      <w:footerReference w:type="even" r:id="rId51"/>
-      <w:footerReference w:type="default" r:id="rId52"/>
-      <w:footerReference w:type="first" r:id="rId53"/>
+      <w:headerReference w:type="even" r:id="rId49"/>
+      <w:headerReference w:type="default" r:id="rId50"/>
+      <w:headerReference w:type="first" r:id="rId51"/>
+      <w:footerReference w:type="even" r:id="rId52"/>
+      <w:footerReference w:type="default" r:id="rId53"/>
+      <w:footerReference w:type="first" r:id="rId54"/>
       <w:type w:val="nextPage"/>
       <w:pgSz w:w="11906" w:h="16838"/>
       <w:pgMar w:left="936" w:right="936" w:gutter="0" w:header="0" w:top="720" w:footer="289" w:bottom="720"/>
@@ -9541,7 +9660,7 @@
     </w:r>
     <w:r>
       <w:rPr/>
-      <w:t>23</w:t>
+      <w:t>1</w:t>
     </w:r>
     <w:r>
       <w:rPr/>
@@ -9598,7 +9717,7 @@
     </w:r>
     <w:r>
       <w:rPr/>
-      <w:t>23</w:t>
+      <w:t>1</w:t>
     </w:r>
     <w:r>
       <w:rPr/>
@@ -10811,7 +10930,7 @@
       <w:szCs w:val="24"/>
     </w:rPr>
   </w:style>
-  <w:style w:type="paragraph" w:styleId="ndice">
+  <w:style w:type="paragraph" w:styleId="ndice" w:customStyle="1">
     <w:name w:val="Índice"/>
     <w:basedOn w:val="Normal"/>
     <w:qFormat/>
@@ -10837,7 +10956,7 @@
       <w:szCs w:val="28"/>
     </w:rPr>
   </w:style>
-  <w:style w:type="paragraph" w:styleId="ndiceuser" w:customStyle="1">
+  <w:style w:type="paragraph" w:styleId="ndiceuser">
     <w:name w:val="Índice (user)"/>
     <w:basedOn w:val="Normal"/>
     <w:qFormat/>
@@ -10896,15 +11015,15 @@
       <w:sz w:val="32"/>
     </w:rPr>
   </w:style>
-  <w:style w:type="paragraph" w:styleId="Cabeceraypieuser" w:customStyle="1">
-    <w:name w:val="Cabecera y pie (user)"/>
+  <w:style w:type="paragraph" w:styleId="Cabeceraypie" w:customStyle="1">
+    <w:name w:val="Cabecera y pie"/>
     <w:basedOn w:val="Normal"/>
     <w:qFormat/>
     <w:pPr/>
     <w:rPr/>
   </w:style>
-  <w:style w:type="paragraph" w:styleId="Cabeceraypie">
-    <w:name w:val="Cabecera y pie"/>
+  <w:style w:type="paragraph" w:styleId="Cabeceraypieuser">
+    <w:name w:val="Cabecera y pie (user)"/>
     <w:basedOn w:val="Normal"/>
     <w:qFormat/>
     <w:pPr/>
@@ -11043,8 +11162,8 @@
       <w:bCs/>
     </w:rPr>
   </w:style>
-  <w:style w:type="paragraph" w:styleId="Contenidodelmarcouser" w:customStyle="1">
-    <w:name w:val="Contenido del marco (user)"/>
+  <w:style w:type="paragraph" w:styleId="Contenidodelmarco" w:customStyle="1">
+    <w:name w:val="Contenido del marco"/>
     <w:basedOn w:val="Normal"/>
     <w:qFormat/>
     <w:pPr/>
@@ -11135,8 +11254,8 @@
       <w:lang w:eastAsia="es-ES"/>
     </w:rPr>
   </w:style>
-  <w:style w:type="paragraph" w:styleId="Contenidodelmarco">
-    <w:name w:val="Contenido del marco"/>
+  <w:style w:type="paragraph" w:styleId="Contenidodelmarcouser">
+    <w:name w:val="Contenido del marco (user)"/>
     <w:basedOn w:val="Normal"/>
     <w:qFormat/>
     <w:pPr/>

</xml_diff>